<commit_message>
Lab 2 updates for 26-27 ay
</commit_message>
<xml_diff>
--- a/Lab 02/Lab_02.docx
+++ b/Lab 02/Lab_02.docx
@@ -31,7 +31,7 @@
         <w:pStyle w:val="Date"/>
       </w:pPr>
       <w:r>
-        <w:t xml:space="preserve">2025-10-06</w:t>
+        <w:t xml:space="preserve">2026-09-27</w:t>
       </w:r>
     </w:p>
     <w:p>
@@ -42,7 +42,7 @@
         <w:t xml:space="preserve">Welcome to the second computer lab for Seascape Ecology.</w:t>
       </w:r>
     </w:p>
-    <w:bookmarkStart w:id="22" w:name="learning-objectives"/>
+    <w:bookmarkStart w:id="11" w:name="learning-objectives"/>
     <w:p>
       <w:pPr>
         <w:pStyle w:val="Heading1"/>
@@ -51,7 +51,7 @@
         <w:t xml:space="preserve">Learning objectives</w:t>
       </w:r>
     </w:p>
-    <w:bookmarkStart w:id="20" w:name="part-1"/>
+    <w:bookmarkStart w:id="9" w:name="part-1"/>
     <w:p>
       <w:pPr>
         <w:pStyle w:val="Heading2"/>
@@ -159,8 +159,8 @@
         <w:t xml:space="preserve">To be able to skip and remove elements from various data structures.</w:t>
       </w:r>
     </w:p>
-    <w:bookmarkEnd w:id="20"/>
-    <w:bookmarkStart w:id="21" w:name="part-2"/>
+    <w:bookmarkEnd w:id="9"/>
+    <w:bookmarkStart w:id="10" w:name="part-2"/>
     <w:p>
       <w:pPr>
         <w:pStyle w:val="Heading2"/>
@@ -191,9 +191,9 @@
         <w:t xml:space="preserve">Create a project in RStudio.</w:t>
       </w:r>
     </w:p>
-    <w:bookmarkEnd w:id="21"/>
-    <w:bookmarkEnd w:id="22"/>
-    <w:bookmarkStart w:id="26" w:name="last-week"/>
+    <w:bookmarkEnd w:id="10"/>
+    <w:bookmarkEnd w:id="11"/>
+    <w:bookmarkStart w:id="15" w:name="last-week"/>
     <w:p>
       <w:pPr>
         <w:pStyle w:val="Heading1"/>
@@ -223,7 +223,7 @@
       <w:r>
         <w:t xml:space="preserve"> </w:t>
       </w:r>
-      <w:hyperlink r:id="rId23">
+      <w:hyperlink r:id="rId12">
         <w:r>
           <w:rPr>
             <w:rStyle w:val="Hyperlink"/>
@@ -245,7 +245,7 @@
       <w:r>
         <w:t xml:space="preserve"> </w:t>
       </w:r>
-      <w:hyperlink r:id="rId24">
+      <w:hyperlink r:id="rId13">
         <w:r>
           <w:rPr>
             <w:rStyle w:val="Hyperlink"/>
@@ -354,7 +354,7 @@
       <w:r>
         <w:t xml:space="preserve"> </w:t>
       </w:r>
-      <w:hyperlink r:id="rId25">
+      <w:hyperlink r:id="rId14">
         <w:r>
           <w:rPr>
             <w:rStyle w:val="Hyperlink"/>
@@ -363,8 +363,8 @@
         </w:r>
       </w:hyperlink>
     </w:p>
-    <w:bookmarkEnd w:id="26"/>
-    <w:bookmarkStart w:id="37" w:name="this-week"/>
+    <w:bookmarkEnd w:id="15"/>
+    <w:bookmarkStart w:id="26" w:name="this-week"/>
     <w:p>
       <w:pPr>
         <w:pStyle w:val="Heading1"/>
@@ -378,7 +378,7 @@
         <w:pStyle w:val="FirstParagraph"/>
       </w:pPr>
       <w:r>
-        <w:t xml:space="preserve">This week we’ll continue refreshing a few concepts from your first year module SOES 1015 (Part 1), and we’ll start to explore workflow and project management (Part 2):</w:t>
+        <w:t xml:space="preserve">This week we’ll continue refreshing a few concepts from your first year module SOES 1017 (Part 1), and we’ll start to explore workflow and project management (Part 2):</w:t>
       </w:r>
     </w:p>
     <w:p>
@@ -433,7 +433,7 @@
         <w:t xml:space="preserve">Workflow and project management.</w:t>
       </w:r>
     </w:p>
-    <w:bookmarkStart w:id="30" w:name="resources"/>
+    <w:bookmarkStart w:id="19" w:name="resources"/>
     <w:p>
       <w:pPr>
         <w:pStyle w:val="Heading2"/>
@@ -452,7 +452,7 @@
       <w:r>
         <w:t xml:space="preserve"> </w:t>
       </w:r>
-      <w:hyperlink r:id="rId27">
+      <w:hyperlink r:id="rId16">
         <w:r>
           <w:rPr>
             <w:rStyle w:val="Hyperlink"/>
@@ -469,7 +469,7 @@
       <w:r>
         <w:t xml:space="preserve"> </w:t>
       </w:r>
-      <w:hyperlink r:id="rId28">
+      <w:hyperlink r:id="rId17">
         <w:r>
           <w:rPr>
             <w:rStyle w:val="Hyperlink"/>
@@ -486,7 +486,7 @@
       <w:r>
         <w:t xml:space="preserve"> </w:t>
       </w:r>
-      <w:hyperlink r:id="rId29">
+      <w:hyperlink r:id="rId18">
         <w:r>
           <w:rPr>
             <w:rStyle w:val="Hyperlink"/>
@@ -522,8 +522,8 @@
         <w:t xml:space="preserve">R you’re probably used to at the moment). We’ll also use two lessons from Software Carpentry again.</w:t>
       </w:r>
     </w:p>
-    <w:bookmarkEnd w:id="30"/>
-    <w:bookmarkStart w:id="36" w:name="but-first-a-data-science-process"/>
+    <w:bookmarkEnd w:id="19"/>
+    <w:bookmarkStart w:id="25" w:name="but-first-a-data-science-process"/>
     <w:p>
       <w:pPr>
         <w:pStyle w:val="Heading2"/>
@@ -541,18 +541,18 @@
           <wp:inline>
             <wp:extent cx="4599523" cy="1553562"/>
             <wp:effectExtent b="0" l="0" r="0" t="0"/>
-            <wp:docPr descr="Wickham and Grolemund’s model of the data science process. “In [our] model of the data science process you start with data import and tidying. Next you understand your data with an iterative cycle of transforming, visualizing, and modeling. You finish the process by communicating your results to other humans”. From https://r4ds.hadley.nz/intro." title="" id="32" name="Picture"/>
+            <wp:docPr descr="Wickham and Grolemund’s model of the data science process. “In [our] model of the data science process you start with data import and tidying. Next you understand your data with an iterative cycle of transforming, visualizing, and modeling. You finish the process by communicating your results to other humans”. From https://r4ds.hadley.nz/intro." title="" id="21" name="Picture"/>
             <a:graphic>
               <a:graphicData uri="http://schemas.openxmlformats.org/drawingml/2006/picture">
                 <pic:pic>
                   <pic:nvPicPr>
-                    <pic:cNvPr descr="resources/base_v2.png" id="33" name="Picture"/>
+                    <pic:cNvPr descr="Lab_02_files/resources/base_v2.png" id="22" name="Picture"/>
                     <pic:cNvPicPr>
                       <a:picLocks noChangeArrowheads="1" noChangeAspect="1"/>
                     </pic:cNvPicPr>
                   </pic:nvPicPr>
                   <pic:blipFill>
-                    <a:blip r:embed="rId31"/>
+                    <a:blip r:embed="rId20"/>
                     <a:stretch>
                       <a:fillRect/>
                     </a:stretch>
@@ -598,7 +598,7 @@
       <w:r>
         <w:t xml:space="preserve"> </w:t>
       </w:r>
-      <w:hyperlink r:id="rId34">
+      <w:hyperlink r:id="rId23">
         <w:r>
           <w:rPr>
             <w:rStyle w:val="Hyperlink"/>
@@ -610,7 +610,7 @@
         <w:t xml:space="preserve">.</w:t>
       </w:r>
     </w:p>
-    <w:bookmarkStart w:id="35" w:name="whats-the-point"/>
+    <w:bookmarkStart w:id="24" w:name="whats-the-point"/>
     <w:p>
       <w:pPr>
         <w:pStyle w:val="Heading3"/>
@@ -666,10 +666,10 @@
         <w:t xml:space="preserve">.</w:t>
       </w:r>
     </w:p>
-    <w:bookmarkEnd w:id="35"/>
-    <w:bookmarkEnd w:id="36"/>
-    <w:bookmarkEnd w:id="37"/>
-    <w:bookmarkStart w:id="43" w:name="part-1-1"/>
+    <w:bookmarkEnd w:id="24"/>
+    <w:bookmarkEnd w:id="25"/>
+    <w:bookmarkEnd w:id="26"/>
+    <w:bookmarkStart w:id="32" w:name="part-1-1"/>
     <w:p>
       <w:pPr>
         <w:pStyle w:val="Heading1"/>
@@ -678,7 +678,7 @@
         <w:t xml:space="preserve">Part 1</w:t>
       </w:r>
     </w:p>
-    <w:bookmarkStart w:id="42" w:name="data-tidying"/>
+    <w:bookmarkStart w:id="31" w:name="data-tidying"/>
     <w:p>
       <w:pPr>
         <w:pStyle w:val="Heading2"/>
@@ -713,7 +713,7 @@
       <w:r>
         <w:t xml:space="preserve"> </w:t>
       </w:r>
-      <w:hyperlink r:id="rId38">
+      <w:hyperlink r:id="rId27">
         <w:r>
           <w:rPr>
             <w:rStyle w:val="Hyperlink"/>
@@ -742,7 +742,7 @@
       <w:r>
         <w:t xml:space="preserve"> </w:t>
       </w:r>
-      <w:hyperlink r:id="rId39">
+      <w:hyperlink r:id="rId28">
         <w:r>
           <w:rPr>
             <w:rStyle w:val="Hyperlink"/>
@@ -768,7 +768,7 @@
       <w:r>
         <w:t xml:space="preserve"> </w:t>
       </w:r>
-      <w:hyperlink r:id="rId40">
+      <w:hyperlink r:id="rId29">
         <w:r>
           <w:rPr>
             <w:rStyle w:val="Hyperlink"/>
@@ -782,7 +782,7 @@
         <w:pStyle w:val="FirstParagraph"/>
       </w:pPr>
       <w:r>
-        <w:t xml:space="preserve">Josh and I will be walking around to help out and answer questions. We’ll take 30 minutes to work through the two exercises, then we’ll carry on with Part 2 of the lab together.</w:t>
+        <w:t xml:space="preserve">I will be walking around to help out and answer questions. We’ll take 30 minutes to work through the two exercises, then we’ll carry on with Part 2 of the lab together.</w:t>
       </w:r>
     </w:p>
     <w:p>
@@ -1059,7 +1059,7 @@
         <w:rPr>
           <w:rStyle w:val="CommentTok"/>
         </w:rPr>
-        <w:t xml:space="preserve"># Or load the cats data from file</w:t>
+        <w:t xml:space="preserve"># Or, if you are using the same folder/working directory as last week, load the cats data from file</w:t>
       </w:r>
       <w:r>
         <w:br/>
@@ -1116,7 +1116,7 @@
         <w:rPr>
           <w:rStyle w:val="CommentTok"/>
         </w:rPr>
-        <w:t xml:space="preserve"># Or get it directly from the internet</w:t>
+        <w:t xml:space="preserve"># Alternatively, get it directly from the internet (sometimes this fails)</w:t>
       </w:r>
       <w:r>
         <w:br/>
@@ -1184,12 +1184,12 @@
         <w:t xml:space="preserve"> </w:t>
       </w:r>
       <w:r>
-        <w:t xml:space="preserve">dataset. You can download it directly from the internet, then read it in using the following R code. If you don’t manage to do this, you can download it from the module Github repository:</w:t>
-      </w:r>
-      <w:r>
-        <w:t xml:space="preserve"> </w:t>
-      </w:r>
-      <w:hyperlink r:id="rId41">
+        <w:t xml:space="preserve">dataset. You can download it directly from the internet, then read it in using the following R code. If you don’t manage to do this, you can download it from the Seascape Ecology Github repository:</w:t>
+      </w:r>
+      <w:r>
+        <w:t xml:space="preserve"> </w:t>
+      </w:r>
+      <w:hyperlink r:id="rId30">
         <w:r>
           <w:rPr>
             <w:rStyle w:val="Hyperlink"/>
@@ -1200,6 +1200,14 @@
     </w:p>
     <w:p>
       <w:pPr>
+        <w:pStyle w:val="BodyText"/>
+      </w:pPr>
+      <w:r>
+        <w:t xml:space="preserve">If you download the file yourself, put it in your working directory.</w:t>
+      </w:r>
+    </w:p>
+    <w:p>
+      <w:pPr>
         <w:pStyle w:val="SourceCode"/>
       </w:pPr>
       <w:r>
@@ -1390,9 +1398,9 @@
         <w:t xml:space="preserve">)</w:t>
       </w:r>
     </w:p>
-    <w:bookmarkEnd w:id="42"/>
-    <w:bookmarkEnd w:id="43"/>
-    <w:bookmarkStart w:id="47" w:name="part-2---workflows-and-projects"/>
+    <w:bookmarkEnd w:id="31"/>
+    <w:bookmarkEnd w:id="32"/>
+    <w:bookmarkStart w:id="36" w:name="part-2---workflows-and-projects"/>
     <w:p>
       <w:pPr>
         <w:pStyle w:val="Heading1"/>
@@ -1401,7 +1409,7 @@
         <w:t xml:space="preserve">Part 2 - Workflows and Projects</w:t>
       </w:r>
     </w:p>
-    <w:bookmarkStart w:id="44" w:name="scripts"/>
+    <w:bookmarkStart w:id="33" w:name="scripts"/>
     <w:p>
       <w:pPr>
         <w:pStyle w:val="Heading2"/>
@@ -1515,7 +1523,7 @@
         <w:rPr>
           <w:rStyle w:val="CommentTok"/>
         </w:rPr>
-        <w:t xml:space="preserve"># 2025-10-06</w:t>
+        <w:t xml:space="preserve"># 2026-09-28</w:t>
       </w:r>
       <w:r>
         <w:br/>
@@ -1561,7 +1569,7 @@
           <w:i/>
           <w:iCs/>
         </w:rPr>
-        <w:t xml:space="preserve">“The key to using the script editor effectively is to memorise one of the most important keyboard shortcuts: Cmd/Ctrl + Enter. This executes the current R expression in the console… It will also move the cursor to the next statement (beginning with not_cancelled %&gt;%). That makes it easy to run your complete script by repeatedly pressing Cmd/Ctrl + Enter.”</w:t>
+        <w:t xml:space="preserve">“The key to using the script editor effectively is to memorise one of the most important keyboard shortcuts: Cmd/Ctrl + Enter. This executes the current R expression in the console… It will also move the cursor to the next statement (beginning with &gt;). That makes it easy to run your complete script by repeatedly pressing Cmd/Ctrl + Enter.”</w:t>
       </w:r>
     </w:p>
     <w:p>
@@ -1580,8 +1588,8 @@
         <w:t xml:space="preserve">R scripts are saved with a .R or .r extension.</w:t>
       </w:r>
     </w:p>
-    <w:bookmarkEnd w:id="44"/>
-    <w:bookmarkStart w:id="46" w:name="projects"/>
+    <w:bookmarkEnd w:id="33"/>
+    <w:bookmarkStart w:id="35" w:name="projects"/>
     <w:p>
       <w:pPr>
         <w:pStyle w:val="Heading2"/>
@@ -1602,7 +1610,7 @@
       <w:pPr>
         <w:pStyle w:val="BodyText"/>
       </w:pPr>
-      <w:hyperlink r:id="rId45">
+      <w:hyperlink r:id="rId34">
         <w:r>
           <w:rPr>
             <w:rStyle w:val="Hyperlink"/>
@@ -1611,8 +1619,8 @@
         </w:r>
       </w:hyperlink>
     </w:p>
-    <w:bookmarkEnd w:id="46"/>
-    <w:bookmarkEnd w:id="47"/>
+    <w:bookmarkEnd w:id="35"/>
+    <w:bookmarkEnd w:id="36"/>
     <w:sectPr>
       <w:footnotePr>
         <w:numRestart w:val="eachSect"/>
@@ -2114,10 +2122,10 @@
   <w:docDefaults>
     <w:rPrDefault>
       <w:rPr>
-        <w:rFonts w:asciiTheme="minorHAnsi" w:cstheme="minorBidi" w:eastAsiaTheme="minorHAnsi" w:hAnsiTheme="minorHAnsi"/>
+        <w:rFonts w:asciiTheme="minorHAnsi" w:cstheme="minorBidi" w:eastAsiaTheme="minorEastAsia" w:hAnsiTheme="minorHAnsi"/>
         <w:sz w:val="24"/>
         <w:szCs w:val="24"/>
-        <w:lang w:bidi="ar-SA" w:eastAsia="en-US" w:val="en-US"/>
+        <w:lang w:bidi="ar-SA" w:eastAsia="zh-CN" w:val="en-US"/>
       </w:rPr>
     </w:rPrDefault>
     <w:pPrDefault>
@@ -2658,13 +2666,6 @@
       </w:tblCellMar>
     </w:tblPr>
     <w:tblStylePr w:type="firstRow">
-      <w:tblPr>
-        <w:jc w:val="left"/>
-        <w:tblInd w:type="dxa" w:w="0"/>
-      </w:tblPr>
-      <w:trPr>
-        <w:jc w:val="left"/>
-      </w:trPr>
       <w:tcPr>
         <w:tcBorders>
           <w:bottom w:val="single"/>

</xml_diff>